<commit_message>
Correct school name to HIKSVS in reference check forms
Co-Authored-By: Claude Fable 5.1 <noreply@anthropic.com>
Claude-Session: https://claude.ai/code/session_01RjT1wM8LWwwiMNwDeHsgEW
</commit_message>
<xml_diff>
--- a/hr-forms/Verbal Reference Check Form - Full.docx
+++ b/hr-forms/Verbal Reference Check Form - Full.docx
@@ -33,44 +33,20 @@
         <w:pStyle w:val="Subtitle"/>
       </w:pPr>
       <w:r>
-        <w:t xml:space="preserve">Wycombe</w:t>
-      </w:r>
-      <w:r>
-        <w:t xml:space="preserve"> </w:t>
-      </w:r>
-      <w:r>
-        <w:t xml:space="preserve">Abbey</w:t>
-      </w:r>
-      <w:r>
-        <w:t xml:space="preserve"> </w:t>
-      </w:r>
-      <w:r>
-        <w:t xml:space="preserve">School</w:t>
-      </w:r>
-      <w:r>
-        <w:t xml:space="preserve"> </w:t>
-      </w:r>
-      <w:r>
-        <w:t xml:space="preserve">Changzhou.</w:t>
-      </w:r>
-      <w:r>
-        <w:t xml:space="preserve"> </w:t>
-      </w:r>
-      <w:r>
-        <w:t xml:space="preserve">Safer</w:t>
-      </w:r>
-      <w:r>
-        <w:t xml:space="preserve"> </w:t>
-      </w:r>
-      <w:r>
-        <w:t xml:space="preserve">recruitment.</w:t>
-      </w:r>
-      <w:r>
-        <w:t xml:space="preserve"> </w:t>
-      </w:r>
-      <w:r>
-        <w:t xml:space="preserve">Confidential.</w:t>
-      </w:r>
+        <w:t>HIKSVS. Safer recruitment. Confidential.</w:t>
+      </w:r>
+      <w:r/>
+      <w:r/>
+      <w:r/>
+      <w:r/>
+      <w:r/>
+      <w:r/>
+      <w:r/>
+      <w:r/>
+      <w:r/>
+      <w:r/>
+      <w:r/>
+      <w:r/>
     </w:p>
     <w:bookmarkStart w:id="20" w:name="purpose-and-instructions-for-the-caller"/>
     <w:p>
@@ -4059,7 +4035,7 @@
         <w:pStyle w:val="BlockText"/>
       </w:pPr>
       <w:r>
-        <w:t xml:space="preserve">Good morning / afternoon. My name is [name] and I am [role] at Wycombe Abbey School Changzhou. I am calling about [candidate name], who has applied for the post of [post] with us and has given your name as a referee. Thank you for the written reference you provided on [date]. As part of our safer recruitment process we verify all references verbally. The call will take around fifteen to twenty minutes. I will be taking notes, which will be kept on the candidate’s confidential recruitment file. Under data protection law the candidate may be entitled to see those notes. Is now a convenient time, and are you happy to proceed on that basis?</w:t>
+        <w:t>Good morning / afternoon. My name is [name] and I am [role] at HIKSVS. I am calling about [candidate name], who has applied for the post of [post] with us and has given your name as a referee. Thank you for the written reference you provided on [date]. As part of our safer recruitment process we verify all references verbally. The call will take around fifteen to twenty minutes. I will be taking notes, which will be kept on the candidate’s confidential recruitment file. Under data protection law the candidate may be entitled to see those notes. Is now a convenient time, and are you happy to proceed on that basis?</w:t>
       </w:r>
     </w:p>
     <w:p>

</xml_diff>